<commit_message>
fix: injeksi Zotero field Campello 2020 & Rahmah 2016 ke jurnal template
- p[38] DBSCAN: (Campello dkk., 2020) dan (Rahmah & Sitanggang, 2016)
  sebelumnya plain text, sekarang field code dari library TA
- Total Zotero fields: 23 -> 24
- Chen 2019: tidak ada di library Zotero TA, perlu ditambah manual
</commit_message>
<xml_diff>
--- a/DELIVERY/Jurnal Ilmiah - Falah Fahrurozi (DBSCAN Peluang Karir) - Template Penelitian - FINAL.docx
+++ b/DELIVERY/Jurnal Ilmiah - Falah Fahrurozi (DBSCAN Peluang Karir) - Template Penelitian - FINAL.docx
@@ -3505,7 +3505,50 @@
           <w:sz w:val="24"/>
           <w:szCs w:val="24"/>
         </w:rPr>
-        <w:t>Matriks data yang terdiri dari atribut spasial (latitude, longitude) diumpankan ke dalam algoritma DBSCAN (Campello dkk., 2020). Parameter epsilon (eps) dan MinPts ditentukan melalui pendekatan berbasis K-Means (Chen dkk., 2019). Algoritma ini dipilih karena kemampuannya mendeteksi bentuk klaster spasial yang asimetris secara organik tanpa memerlukan estimasi awal jumlah klaster, serta keunggulannya dalam mengisolasi titik anomali di wilayah pelosok. Parameter sentral algoritma ditetapkan melalui pendekatan heuristik K-distance graph (Rahmah &amp; Sitanggang, 2016), dengan nilai epsilon () sebesar 0,08 dan MinPts sebesar 3. Untuk setiap titik yang belum dieksekusi, algoritma menghitung jarak Euclidean dua dimensi ke seluruh titik lainnya; titik dengan tetangga minimal MinPts dalam radius epsilon diklasifikasikan sebagai core point, titik dalam jangkauan core point sebagai border point, dan titik yang terisolasi sebagai noise point. Ekspansi klaster dilakukan secara rekursif hingga seluruh titik memiliki label.</w:t>
+        <w:t xml:space="preserve">Matriks data yang terdiri dari atribut spasial (latitude, longitude) diumpankan ke dalam algoritma DBSCAN (Campello dkk., 2020). Parameter epsilon (eps) dan MinPts ditentukan melalui pendekatan berbasis K-Means (Chen dkk., 2019). Algoritma ini dipilih karena kemampuannya mendeteksi bentuk klaster spasial yang asimetris secara organik tanpa memerlukan estimasi awal jumlah klaster, serta keunggulannya dalam mengisolasi titik anomali di wilayah pelosok. Parameter sentral algoritma ditetapkan melalui pendekatan heuristik K-distance graph </w:t>
+      </w:r>
+      <w:r>
+        <w:rPr>
+          <w:rFonts w:ascii="Times New Roman" w:eastAsia="Times New Roman" w:hAnsi="Times New Roman" w:cs="Times New Roman"/>
+          <w:sz w:val="24"/>
+          <w:szCs w:val="24"/>
+        </w:rPr>
+        <w:fldChar w:fldCharType="begin"/>
+      </w:r>
+      <w:r>
+        <w:instrText xml:space="preserve"> ADDIN ZOTERO_ITEM CSL_CITATION {"citationID":"XmGr2wGO","properties":{"formattedCitation":"(Rahmah &amp; Sitanggang, 2016)","plainCitation":"(Rahmah &amp; Sitanggang, 2016)","noteIndex":0},"citationItems":[{"id":86,"uris":["http://zotero.org/users/local/1/items/bAhbjIlB","http://zotero.org/users/local/Xv0VPhcB/items/bAhbjIlB"],"itemData":{"id":86,"type":"paper-conference","container-title":"IOP Conference Series: Earth and Environmental Science","DOI":"10.1088/1755-1315/31/1/012012","issue":"1","page":"012012","title":"Determination of optimal epsilon (eps) value on DBSCAN algorithm to clustering data on peatland hotspots in Sumatra","URL":"https://doi.org/10.1088/1755-1315/31/1/012012","volume":"31","author":[{"family":"Rahmah","given":"Nadia"},{"family":"Sitanggang","given":"Imas Sukaesih"}],"issued":{"date-parts":[["2016"]]}}}],"schema":"https://github.com/citation-style-language/schema/raw/master/csl-citation.json"} </w:instrText>
+      </w:r>
+      <w:r>
+        <w:rPr>
+          <w:rFonts w:ascii="Times New Roman" w:eastAsia="Times New Roman" w:hAnsi="Times New Roman" w:cs="Times New Roman"/>
+          <w:sz w:val="24"/>
+          <w:szCs w:val="24"/>
+        </w:rPr>
+        <w:fldChar w:fldCharType="separate"/>
+      </w:r>
+      <w:r>
+        <w:rPr>
+          <w:rFonts w:ascii="Times New Roman" w:eastAsia="Times New Roman" w:hAnsi="Times New Roman" w:cs="Times New Roman"/>
+          <w:sz w:val="24"/>
+          <w:szCs w:val="24"/>
+        </w:rPr>
+        <w:t xml:space="preserve">(Rahmah &amp; Sitanggang, 2016)</w:t>
+      </w:r>
+      <w:r>
+        <w:rPr>
+          <w:rFonts w:ascii="Times New Roman" w:eastAsia="Times New Roman" w:hAnsi="Times New Roman" w:cs="Times New Roman"/>
+          <w:sz w:val="24"/>
+          <w:szCs w:val="24"/>
+        </w:rPr>
+        <w:fldChar w:fldCharType="end"/>
+      </w:r>
+      <w:r>
+        <w:rPr>
+          <w:rFonts w:ascii="Times New Roman" w:eastAsia="Times New Roman" w:hAnsi="Times New Roman" w:cs="Times New Roman"/>
+          <w:sz w:val="24"/>
+          <w:szCs w:val="24"/>
+        </w:rPr>
+        <w:t xml:space="preserve">, dengan nilai epsilon () sebesar 0,08 dan MinPts sebesar 3. Untuk setiap titik yang belum dieksekusi, algoritma menghitung jarak Euclidean dua dimensi ke seluruh titik lainnya; titik dengan tetangga minimal MinPts dalam radius epsilon diklasifikasikan sebagai core point, titik dalam jangkauan core point sebagai border point, dan titik yang terisolasi sebagai noise point. Ekspansi klaster dilakukan secara rekursif hingga seluruh titik memiliki label.</w:t>
       </w:r>
     </w:p>
     <w:p>

</xml_diff>

<commit_message>
fix: injeksi Zotero field Chen dkk. 2019 + rebuild p[38] 3 citation sekaligus
- p[38] DBSCAN: Campello 2020 + Chen 2019 + Rahmah 2016 semua field dalam 1 pass
- Chen 2019 dibuild dari bibliografis (tidak ada di library TA)
- Total Zotero fields: 24 -> 26
</commit_message>
<xml_diff>
--- a/DELIVERY/Jurnal Ilmiah - Falah Fahrurozi (DBSCAN Peluang Karir) - Template Penelitian - FINAL.docx
+++ b/DELIVERY/Jurnal Ilmiah - Falah Fahrurozi (DBSCAN Peluang Karir) - Template Penelitian - FINAL.docx
@@ -3505,7 +3505,93 @@
           <w:sz w:val="24"/>
           <w:szCs w:val="24"/>
         </w:rPr>
-        <w:t xml:space="preserve">Matriks data yang terdiri dari atribut spasial (latitude, longitude) diumpankan ke dalam algoritma DBSCAN (Campello dkk., 2020). Parameter epsilon (eps) dan MinPts ditentukan melalui pendekatan berbasis K-Means (Chen dkk., 2019). Algoritma ini dipilih karena kemampuannya mendeteksi bentuk klaster spasial yang asimetris secara organik tanpa memerlukan estimasi awal jumlah klaster, serta keunggulannya dalam mengisolasi titik anomali di wilayah pelosok. Parameter sentral algoritma ditetapkan melalui pendekatan heuristik K-distance graph </w:t>
+        <w:t xml:space="preserve">Matriks data yang terdiri dari atribut spasial (latitude, longitude) diumpankan ke dalam algoritma DBSCAN </w:t>
+      </w:r>
+      <w:r>
+        <w:rPr>
+          <w:rFonts w:ascii="Times New Roman" w:eastAsia="Times New Roman" w:hAnsi="Times New Roman" w:cs="Times New Roman"/>
+          <w:sz w:val="24"/>
+          <w:szCs w:val="24"/>
+        </w:rPr>
+        <w:fldChar w:fldCharType="begin"/>
+      </w:r>
+      <w:r>
+        <w:instrText xml:space="preserve"> ADDIN ZOTERO_ITEM CSL_CITATION {"citationID":"KRUNSvMf","properties":{"formattedCitation":"(Campello dkk., 2020)","plainCitation":"(Campello dkk., 2020)","noteIndex":0},"citationItems":[{"id":91,"uris":["http://zotero.org/users/local/1/items/6q5cTG6w","http://zotero.org/users/local/Xv0VPhcB/items/6q5cTG6w"],"itemData":{"id":91,"type":"article-journal","container-title":"WIREs Data Mining and Knowledge Discovery","DOI":"10.1002/widm.1343","issue":"2","note":"pengganti Ester 1996 (DBSCAN/density clustering, ditulis Sander)","page":"e1343","title":"Density-based clustering","volume":"10","author":[{"family":"Campello","given":"Ricardo J. G. B."},{"family":"Kröger","given":"Peer"},{"family":"Sander","given":"Jörg"},{"family":"Zimek","given":"Arthur"}],"issued":{"date-parts":[["2020"]]}}}],"schema":"https://github.com/citation-style-language/schema/raw/master/csl-citation.json"} </w:instrText>
+      </w:r>
+      <w:r>
+        <w:rPr>
+          <w:rFonts w:ascii="Times New Roman" w:eastAsia="Times New Roman" w:hAnsi="Times New Roman" w:cs="Times New Roman"/>
+          <w:sz w:val="24"/>
+          <w:szCs w:val="24"/>
+        </w:rPr>
+        <w:fldChar w:fldCharType="separate"/>
+      </w:r>
+      <w:r>
+        <w:rPr>
+          <w:rFonts w:ascii="Times New Roman" w:eastAsia="Times New Roman" w:hAnsi="Times New Roman" w:cs="Times New Roman"/>
+          <w:sz w:val="24"/>
+          <w:szCs w:val="24"/>
+        </w:rPr>
+        <w:t xml:space="preserve">(Campello dkk., 2020)</w:t>
+      </w:r>
+      <w:r>
+        <w:rPr>
+          <w:rFonts w:ascii="Times New Roman" w:eastAsia="Times New Roman" w:hAnsi="Times New Roman" w:cs="Times New Roman"/>
+          <w:sz w:val="24"/>
+          <w:szCs w:val="24"/>
+        </w:rPr>
+        <w:fldChar w:fldCharType="end"/>
+      </w:r>
+      <w:r>
+        <w:rPr>
+          <w:rFonts w:ascii="Times New Roman" w:eastAsia="Times New Roman" w:hAnsi="Times New Roman" w:cs="Times New Roman"/>
+          <w:sz w:val="24"/>
+          <w:szCs w:val="24"/>
+        </w:rPr>
+        <w:t xml:space="preserve">. Parameter epsilon (eps) dan MinPts ditentukan melalui pendekatan berbasis K-Means </w:t>
+      </w:r>
+      <w:r>
+        <w:rPr>
+          <w:rFonts w:ascii="Times New Roman" w:eastAsia="Times New Roman" w:hAnsi="Times New Roman" w:cs="Times New Roman"/>
+          <w:sz w:val="24"/>
+          <w:szCs w:val="24"/>
+        </w:rPr>
+        <w:fldChar w:fldCharType="begin"/>
+      </w:r>
+      <w:r>
+        <w:instrText xml:space="preserve"> ADDIN ZOTERO_ITEM CSL_CITATION {"citationID": "chenDkk2019", "properties": {"formattedCitation": "(Chen dkk., 2019)", "plainCitation": "(Chen dkk., 2019)", "noteIndex": 0}, "citationItems": [{"id": 9901, "uris": ["http://zotero.org/users/local/1/items/ChenDBSCAN2019"], "itemData": {"id": 9901, "type": "article-journal", "title": "Parameter selection algorithm of DBSCAN based on K-Means two classification algorithm", "container-title": "The Journal of Engineering", "volume": "2019", "issue": "23", "page": "8676-8679", "author": [{"family": "Chen", "given": "S."}, {"family": "Liu", "given": "X."}, {"family": "Ma", "given": "J."}, {"family": "Zhao", "given": "S."}, {"family": "Hou", "given": "X."}], "issued": {"date-parts": [["2019"]]}}}], "schema": "https://github.com/citation-style-language/schema/raw/master/csl-citation.json"} </w:instrText>
+      </w:r>
+      <w:r>
+        <w:rPr>
+          <w:rFonts w:ascii="Times New Roman" w:eastAsia="Times New Roman" w:hAnsi="Times New Roman" w:cs="Times New Roman"/>
+          <w:sz w:val="24"/>
+          <w:szCs w:val="24"/>
+        </w:rPr>
+        <w:fldChar w:fldCharType="separate"/>
+      </w:r>
+      <w:r>
+        <w:rPr>
+          <w:rFonts w:ascii="Times New Roman" w:eastAsia="Times New Roman" w:hAnsi="Times New Roman" w:cs="Times New Roman"/>
+          <w:sz w:val="24"/>
+          <w:szCs w:val="24"/>
+        </w:rPr>
+        <w:t xml:space="preserve">(Chen dkk., 2019)</w:t>
+      </w:r>
+      <w:r>
+        <w:rPr>
+          <w:rFonts w:ascii="Times New Roman" w:eastAsia="Times New Roman" w:hAnsi="Times New Roman" w:cs="Times New Roman"/>
+          <w:sz w:val="24"/>
+          <w:szCs w:val="24"/>
+        </w:rPr>
+        <w:fldChar w:fldCharType="end"/>
+      </w:r>
+      <w:r>
+        <w:rPr>
+          <w:rFonts w:ascii="Times New Roman" w:eastAsia="Times New Roman" w:hAnsi="Times New Roman" w:cs="Times New Roman"/>
+          <w:sz w:val="24"/>
+          <w:szCs w:val="24"/>
+        </w:rPr>
+        <w:t xml:space="preserve">. Algoritma ini dipilih karena kemampuannya mendeteksi bentuk klaster spasial yang asimetris secara organik tanpa memerlukan estimasi awal jumlah klaster, serta keunggulannya dalam mengisolasi titik anomali di wilayah pelosok. Parameter sentral algoritma ditetapkan melalui pendekatan heuristik K-distance graph </w:t>
       </w:r>
       <w:r>
         <w:rPr>

</xml_diff>

<commit_message>
fix: audit final pra-bimbingan — selaraskan nilai metrik (93/4/eps 0.08) di TA p667-669, build_notebook, LAMPIRAN x2, naskah demo
</commit_message>
<xml_diff>
--- a/DELIVERY/Jurnal Ilmiah - Falah Fahrurozi (DBSCAN Peluang Karir) - Template Penelitian - FINAL.docx
+++ b/DELIVERY/Jurnal Ilmiah - Falah Fahrurozi (DBSCAN Peluang Karir) - Template Penelitian - FINAL.docx
@@ -1299,7 +1299,25 @@
           <w:sz w:val="24"/>
           <w:szCs w:val="24"/>
         </w:rPr>
-        <w:t xml:space="preserve"> membandingkan DBSCAN dengan Gaussian Mixture Model (GMM) pada pengelompokan provinsi berdasarkan indikator kesejahteraan sosial ekonomi; pada studi tersebut GMM memperoleh skor validitas lebih tinggi, tetapi DBSCAN tetap menghasilkan dua klaster wilayah kesejahteraan tinggi dan rendah yang mudah diinterpretasi.</w:t>
+        <w:t xml:space="preserve"> membandingkan DBSCAN dengan </w:t>
+      </w:r>
+      <w:r>
+        <w:rPr>
+          <w:rFonts w:ascii="Times New Roman" w:hAnsi="Times New Roman" w:cs="Times New Roman"/>
+          <w:i/>
+          <w:iCs/>
+          <w:sz w:val="24"/>
+          <w:szCs w:val="24"/>
+        </w:rPr>
+        <w:t>Gaussian Mixture Model</w:t>
+      </w:r>
+      <w:r>
+        <w:rPr>
+          <w:rFonts w:ascii="Times New Roman" w:hAnsi="Times New Roman" w:cs="Times New Roman"/>
+          <w:sz w:val="24"/>
+          <w:szCs w:val="24"/>
+        </w:rPr>
+        <w:t xml:space="preserve"> (GMM) pada pengelompokan provinsi berdasarkan indikator kesejahteraan sosial ekonomi; pada studi tersebut GMM memperoleh skor validitas lebih tinggi, tetapi DBSCAN tetap menghasilkan dua klaster wilayah kesejahteraan tinggi dan rendah yang mudah diinterpretasi.</w:t>
       </w:r>
     </w:p>
     <w:p>
@@ -3532,7 +3550,7 @@
           <w:sz w:val="24"/>
           <w:szCs w:val="24"/>
         </w:rPr>
-        <w:t xml:space="preserve">(Campello dkk., 2020)</w:t>
+        <w:t>(Campello dkk., 2020)</w:t>
       </w:r>
       <w:r>
         <w:rPr>
@@ -3575,7 +3593,7 @@
           <w:sz w:val="24"/>
           <w:szCs w:val="24"/>
         </w:rPr>
-        <w:t xml:space="preserve">(Chen dkk., 2019)</w:t>
+        <w:t>(Chen dkk., 2019)</w:t>
       </w:r>
       <w:r>
         <w:rPr>
@@ -3618,7 +3636,7 @@
           <w:sz w:val="24"/>
           <w:szCs w:val="24"/>
         </w:rPr>
-        <w:t xml:space="preserve">(Rahmah &amp; Sitanggang, 2016)</w:t>
+        <w:t>(Rahmah &amp; Sitanggang, 2016)</w:t>
       </w:r>
       <w:r>
         <w:rPr>
@@ -3634,7 +3652,7 @@
           <w:sz w:val="24"/>
           <w:szCs w:val="24"/>
         </w:rPr>
-        <w:t xml:space="preserve">, dengan nilai epsilon () sebesar 0,08 dan MinPts sebesar 3. Untuk setiap titik yang belum dieksekusi, algoritma menghitung jarak Euclidean dua dimensi ke seluruh titik lainnya; titik dengan tetangga minimal MinPts dalam radius epsilon diklasifikasikan sebagai core point, titik dalam jangkauan core point sebagai border point, dan titik yang terisolasi sebagai noise point. Ekspansi klaster dilakukan secara rekursif hingga seluruh titik memiliki label.</w:t>
+        <w:t>, dengan nilai epsilon () sebesar 0,08 dan MinPts sebesar 3. Untuk setiap titik yang belum dieksekusi, algoritma menghitung jarak Euclidean dua dimensi ke seluruh titik lainnya; titik dengan tetangga minimal MinPts dalam radius epsilon diklasifikasikan sebagai core point, titik dalam jangkauan core point sebagai border point, dan titik yang terisolasi sebagai noise point. Ekspansi klaster dilakukan secara rekursif hingga seluruh titik memiliki label.</w:t>
       </w:r>
     </w:p>
     <w:p>
@@ -5261,15 +5279,7 @@
                 <w:sz w:val="24"/>
                 <w:szCs w:val="24"/>
               </w:rPr>
-              <w:t xml:space="preserve">0,4649</w:t>
-            </w:r>
-            <w:r>
-              <w:rPr>
-                <w:rFonts w:ascii="Times New Roman" w:hAnsi="Times New Roman" w:cs="Times New Roman"/>
-                <w:sz w:val="24"/>
-                <w:szCs w:val="24"/>
-              </w:rPr>
-              <w:t/>
+              <w:t>0,4649</w:t>
             </w:r>
           </w:p>
         </w:tc>
@@ -5420,15 +5430,7 @@
                 <w:sz w:val="24"/>
                 <w:szCs w:val="24"/>
               </w:rPr>
-              <w:t xml:space="preserve">0,5294</w:t>
-            </w:r>
-            <w:r>
-              <w:rPr>
-                <w:rFonts w:ascii="Times New Roman" w:hAnsi="Times New Roman" w:cs="Times New Roman"/>
-                <w:sz w:val="24"/>
-                <w:szCs w:val="24"/>
-              </w:rPr>
-              <w:t/>
+              <w:t>0,5294</w:t>
             </w:r>
           </w:p>
         </w:tc>
@@ -5930,22 +5932,14 @@
     <w:p>
       <w:pPr>
         <w:spacing w:before="120" w:after="0" w:line="360" w:lineRule="auto"/>
-        <w:rPr>
-          <w:rFonts w:ascii="Times New Roman" w:eastAsia="Times New Roman" w:hAnsi="Times New Roman" w:cs="Times New Roman"/>
-          <w:b/>
-          <w:sz w:val="24"/>
-          <w:szCs w:val="24"/>
-        </w:rPr>
-      </w:pPr>
-      <w:r>
-        <w:rPr>
-          <w:rFonts w:ascii="Times New Roman" w:eastAsia="Times New Roman" w:hAnsi="Times New Roman" w:cs="Times New Roman"/>
-          <w:b/>
-          <w:sz w:val="24"/>
-          <w:szCs w:val="24"/>
-        </w:rPr>
-        <w:t>UCAPAN TERIMA KASIH</w:t>
-      </w:r>
+        <w:ind w:firstLine="562"/>
+        <w:jc w:val="both"/>
+        <w:rPr>
+          <w:rFonts w:ascii="Times New Roman" w:eastAsia="Times New Roman" w:hAnsi="Times New Roman" w:cs="Times New Roman"/>
+          <w:sz w:val="24"/>
+          <w:szCs w:val="24"/>
+        </w:rPr>
+      </w:pPr>
     </w:p>
     <w:p>
       <w:pPr>
@@ -5958,13 +5952,45 @@
           <w:szCs w:val="24"/>
         </w:rPr>
       </w:pPr>
-      <w:r>
-        <w:rPr>
-          <w:rFonts w:ascii="Times New Roman" w:eastAsia="Times New Roman" w:hAnsi="Times New Roman" w:cs="Times New Roman"/>
+    </w:p>
+    <w:p>
+      <w:pPr>
+        <w:spacing w:before="120" w:after="0" w:line="360" w:lineRule="auto"/>
+        <w:rPr>
+          <w:rFonts w:ascii="Times New Roman" w:eastAsia="Times New Roman" w:hAnsi="Times New Roman" w:cs="Times New Roman"/>
+          <w:b/>
+          <w:sz w:val="24"/>
+          <w:szCs w:val="24"/>
+        </w:rPr>
+      </w:pPr>
+      <w:r>
+        <w:rPr>
+          <w:rFonts w:ascii="Times New Roman" w:eastAsia="Times New Roman" w:hAnsi="Times New Roman" w:cs="Times New Roman"/>
+          <w:b/>
           <w:sz w:val="24"/>
           <w:szCs w:val="24"/>
         </w:rPr>
         <w:lastRenderedPageBreak/>
+        <w:t>UCAPAN TERIMA KASIH</w:t>
+      </w:r>
+    </w:p>
+    <w:p>
+      <w:pPr>
+        <w:spacing w:before="120" w:after="0" w:line="360" w:lineRule="auto"/>
+        <w:ind w:firstLine="562"/>
+        <w:jc w:val="both"/>
+        <w:rPr>
+          <w:rFonts w:ascii="Times New Roman" w:eastAsia="Times New Roman" w:hAnsi="Times New Roman" w:cs="Times New Roman"/>
+          <w:sz w:val="24"/>
+          <w:szCs w:val="24"/>
+        </w:rPr>
+      </w:pPr>
+      <w:r>
+        <w:rPr>
+          <w:rFonts w:ascii="Times New Roman" w:eastAsia="Times New Roman" w:hAnsi="Times New Roman" w:cs="Times New Roman"/>
+          <w:sz w:val="24"/>
+          <w:szCs w:val="24"/>
+        </w:rPr>
         <w:t>Penulis mengucapkan terima kasih kepada Universitas Indraprasta PGRI atas dukungan fasilitas pelaksanaan penelitian, serta kepada para dosen pembimbing yang telah memberikan arahan selama penelitian berlangsung.</w:t>
       </w:r>
     </w:p>
@@ -6424,7 +6450,16 @@
           <w:sz w:val="24"/>
           <w:szCs w:val="24"/>
         </w:rPr>
-        <w:t xml:space="preserve">Oktaviani, D., &amp; Murni, D. (2024). Pengelompokan kabupaten/kota di Provinsi Sumatera Barat berdasarkan sebaran tingkat pengangguran menggunakan metode Density Based Spatial Clustering Applications with Noise. </w:t>
+        <w:t xml:space="preserve">Oktaviani, D., &amp; Murni, D. (2024). Pengelompokan kabupaten/kota di Provinsi Sumatera </w:t>
+      </w:r>
+      <w:r>
+        <w:rPr>
+          <w:rFonts w:ascii="Times New Roman" w:eastAsia="Times New Roman" w:hAnsi="Times New Roman" w:cs="Times New Roman"/>
+          <w:sz w:val="24"/>
+          <w:szCs w:val="24"/>
+        </w:rPr>
+        <w:lastRenderedPageBreak/>
+        <w:t xml:space="preserve">Barat berdasarkan sebaran tingkat pengangguran menggunakan metode Density Based Spatial Clustering Applications with Noise. </w:t>
       </w:r>
       <w:r>
         <w:rPr>
@@ -6441,16 +6476,7 @@
           <w:sz w:val="24"/>
           <w:szCs w:val="24"/>
         </w:rPr>
-        <w:t xml:space="preserve">, </w:t>
-      </w:r>
-      <w:r>
-        <w:rPr>
-          <w:rFonts w:ascii="Times New Roman" w:eastAsia="Times New Roman" w:hAnsi="Times New Roman" w:cs="Times New Roman"/>
-          <w:sz w:val="24"/>
-          <w:szCs w:val="24"/>
-        </w:rPr>
-        <w:lastRenderedPageBreak/>
-        <w:t>9(4), 18-25.</w:t>
+        <w:t>, 9(4), 18-25.</w:t>
       </w:r>
     </w:p>
     <w:p>
@@ -6692,9 +6718,8 @@
       <w:headerReference w:type="even" r:id="rId12"/>
       <w:headerReference w:type="default" r:id="rId13"/>
       <w:footerReference w:type="even" r:id="rId14"/>
-      <w:footerReference w:type="default" r:id="rId15"/>
-      <w:headerReference w:type="first" r:id="rId16"/>
-      <w:footerReference w:type="first" r:id="rId17"/>
+      <w:headerReference w:type="first" r:id="rId15"/>
+      <w:footerReference w:type="first" r:id="rId16"/>
       <w:pgSz w:w="11906" w:h="16838"/>
       <w:pgMar w:top="1843" w:right="1701" w:bottom="1701" w:left="1701" w:header="0" w:footer="0" w:gutter="0"/>
       <w:pgNumType w:start="1"/>
@@ -7084,16 +7109,6 @@
 </file>
 
 <file path=word/footer2.xml><?xml version="1.0" encoding="utf-8"?>
-<w:ftr xmlns:wpc="http://schemas.microsoft.com/office/word/2010/wordprocessingCanvas" xmlns:cx="http://schemas.microsoft.com/office/drawing/2014/chartex" xmlns:cx1="http://schemas.microsoft.com/office/drawing/2015/9/8/chartex" xmlns:cx2="http://schemas.microsoft.com/office/drawing/2015/10/21/chartex" xmlns:cx3="http://schemas.microsoft.com/office/drawing/2016/5/9/chartex" xmlns:cx4="http://schemas.microsoft.com/office/drawing/2016/5/10/chartex" xmlns:cx5="http://schemas.microsoft.com/office/drawing/2016/5/11/chartex" xmlns:cx6="http://schemas.microsoft.com/office/drawing/2016/5/12/chartex" xmlns:cx7="http://schemas.microsoft.com/office/drawing/2016/5/13/chartex" xmlns:cx8="http://schemas.microsoft.com/office/drawing/2016/5/14/chartex" xmlns:mc="http://schemas.openxmlformats.org/markup-compatibility/2006" xmlns:aink="http://schemas.microsoft.com/office/drawing/2016/ink" xmlns:am3d="http://schemas.microsoft.com/office/drawing/2017/model3d" xmlns:o="urn:schemas-microsoft-com:office:office" xmlns:oel="http://schemas.microsoft.com/office/2019/extlst" xmlns:r="http://schemas.openxmlformats.org/officeDocument/2006/relationships" xmlns:m="http://schemas.openxmlformats.org/officeDocument/2006/math" xmlns:v="urn:schemas-microsoft-com:vml" xmlns:wp14="http://schemas.microsoft.com/office/word/2010/wordprocessingDrawing" xmlns:wp="http://schemas.openxmlformats.org/drawingml/2006/wordprocessingDrawing" xmlns:w10="urn:schemas-microsoft-com:office:word" xmlns:w="http://schemas.openxmlformats.org/wordprocessingml/2006/main" xmlns:w14="http://schemas.microsoft.com/office/word/2010/wordml" xmlns:w15="http://schemas.microsoft.com/office/word/2012/wordml" xmlns:w16cex="http://schemas.microsoft.com/office/word/2018/wordml/cex" xmlns:w16cid="http://schemas.microsoft.com/office/word/2016/wordml/cid" xmlns:w16="http://schemas.microsoft.com/office/word/2018/wordml" xmlns:w16du="http://schemas.microsoft.com/office/word/2023/wordml/word16du" xmlns:w16sdtdh="http://schemas.microsoft.com/office/word/2020/wordml/sdtdatahash" xmlns:w16sdtfl="http://schemas.microsoft.com/office/word/2024/wordml/sdtformatlock" xmlns:w16se="http://schemas.microsoft.com/office/word/2015/wordml/symex" xmlns:wpg="http://schemas.microsoft.com/office/word/2010/wordprocessingGroup" xmlns:wpi="http://schemas.microsoft.com/office/word/2010/wordprocessingInk" xmlns:wne="http://schemas.microsoft.com/office/word/2006/wordml" xmlns:wps="http://schemas.microsoft.com/office/word/2010/wordprocessingShape" mc:Ignorable="w14 w15 w16se w16cid w16 w16cex w16sdtdh w16sdtfl w16du wp14">
-  <w:p>
-    <w:pPr>
-      <w:pStyle w:val="Footer"/>
-    </w:pPr>
-  </w:p>
-</w:ftr>
-</file>
-
-<file path=word/footer3.xml><?xml version="1.0" encoding="utf-8"?>
 <w:ftr xmlns:wpc="http://schemas.microsoft.com/office/word/2010/wordprocessingCanvas" xmlns:cx="http://schemas.microsoft.com/office/drawing/2014/chartex" xmlns:cx1="http://schemas.microsoft.com/office/drawing/2015/9/8/chartex" xmlns:cx2="http://schemas.microsoft.com/office/drawing/2015/10/21/chartex" xmlns:cx3="http://schemas.microsoft.com/office/drawing/2016/5/9/chartex" xmlns:cx4="http://schemas.microsoft.com/office/drawing/2016/5/10/chartex" xmlns:cx5="http://schemas.microsoft.com/office/drawing/2016/5/11/chartex" xmlns:cx6="http://schemas.microsoft.com/office/drawing/2016/5/12/chartex" xmlns:cx7="http://schemas.microsoft.com/office/drawing/2016/5/13/chartex" xmlns:cx8="http://schemas.microsoft.com/office/drawing/2016/5/14/chartex" xmlns:mc="http://schemas.openxmlformats.org/markup-compatibility/2006" xmlns:aink="http://schemas.microsoft.com/office/drawing/2016/ink" xmlns:am3d="http://schemas.microsoft.com/office/drawing/2017/model3d" xmlns:o="urn:schemas-microsoft-com:office:office" xmlns:oel="http://schemas.microsoft.com/office/2019/extlst" xmlns:r="http://schemas.openxmlformats.org/officeDocument/2006/relationships" xmlns:m="http://schemas.openxmlformats.org/officeDocument/2006/math" xmlns:v="urn:schemas-microsoft-com:vml" xmlns:wp14="http://schemas.microsoft.com/office/word/2010/wordprocessingDrawing" xmlns:wp="http://schemas.openxmlformats.org/drawingml/2006/wordprocessingDrawing" xmlns:w10="urn:schemas-microsoft-com:office:word" xmlns:w="http://schemas.openxmlformats.org/wordprocessingml/2006/main" xmlns:w14="http://schemas.microsoft.com/office/word/2010/wordml" xmlns:w15="http://schemas.microsoft.com/office/word/2012/wordml" xmlns:w16cex="http://schemas.microsoft.com/office/word/2018/wordml/cex" xmlns:w16cid="http://schemas.microsoft.com/office/word/2016/wordml/cid" xmlns:w16="http://schemas.microsoft.com/office/word/2018/wordml" xmlns:w16du="http://schemas.microsoft.com/office/word/2023/wordml/word16du" xmlns:w16sdtdh="http://schemas.microsoft.com/office/word/2020/wordml/sdtdatahash" xmlns:w16sdtfl="http://schemas.microsoft.com/office/word/2024/wordml/sdtformatlock" xmlns:w16se="http://schemas.microsoft.com/office/word/2015/wordml/symex" xmlns:wpg="http://schemas.microsoft.com/office/word/2010/wordprocessingGroup" xmlns:wpi="http://schemas.microsoft.com/office/word/2010/wordprocessingInk" xmlns:wne="http://schemas.microsoft.com/office/word/2006/wordml" xmlns:wps="http://schemas.microsoft.com/office/word/2010/wordprocessingShape" mc:Ignorable="w14 w15 w16se w16cid w16 w16cex w16sdtdh w16sdtfl w16du wp14">
   <w:p>
     <w:pPr>

</xml_diff>